<commit_message>
Fix hosted bank KYC start and keep the Noah in-app browser on phones.
Return a real error instead of an empty 500, reuse a stable individual KYC key, open the hosted link in Safari/Custom Tabs on iOS/Android and the web sheet on Expo, and send branded verification cutover mail.

Co-authored-by: Cursor <cursoragent@cursor.com>
</commit_message>
<xml_diff>
--- a/output/one-pager/Easner-One-Pager.docx
+++ b/output/one-pager/Easner-One-Pager.docx
@@ -59,9 +59,9 @@
         <w:spacing w:after="240" w:before="0"/>
       </w:pPr>
       <w:r>
-        <w:t>Personal and business</w:t>
+        <w:t>Stablecoin native</w:t>
         <w:br/>
-        <w:t>banking across borders</w:t>
+        <w:t>banking and payments</w:t>
       </w:r>
     </w:p>
     <w:p>
@@ -72,13 +72,13 @@
         <w:rPr>
           <w:sz w:val="24"/>
         </w:rPr>
-        <w:t>Easner brings everyday finances and global payments together. Individuals can manage money at home and abroad, businesses can collect revenue and pay their teams, and partners can build financial products on the same platform.</w:t>
+        <w:t>Easner connects businesses across the Global South and Global North to the US dollar through stablecoin native banking. Built on blockchain, our platform unifies accounts, collections, and global payouts, reducing the need for separate financial workflows in each market.</w:t>
       </w:r>
     </w:p>
     <w:p>
       <w:pPr>
         <w:tabs>
-          <w:tab w:pos="3053" w:val="left"/>
+          <w:tab w:pos="5472" w:val="left"/>
         </w:tabs>
         <w:spacing w:after="40" w:before="0" w:line="600" w:lineRule="exact"/>
       </w:pPr>
@@ -86,24 +86,24 @@
         <w:rPr>
           <w:b/>
           <w:color w:val="007ACC"/>
-          <w:sz w:val="58"/>
+          <w:sz w:val="50"/>
         </w:rPr>
-        <w:t>80+</w:t>
+        <w:t>US dollar access</w:t>
       </w:r>
       <w:r>
         <w:rPr>
           <w:b/>
           <w:color w:val="0A2540"/>
-          <w:sz w:val="42"/>
+          <w:sz w:val="40"/>
         </w:rPr>
         <w:tab/>
-        <w:t>USD  EUR  GBP  NGN</w:t>
+        <w:t>80+ payout destinations</w:t>
       </w:r>
     </w:p>
     <w:p>
       <w:pPr>
         <w:tabs>
-          <w:tab w:pos="3053" w:val="left"/>
+          <w:tab w:pos="5472" w:val="left"/>
         </w:tabs>
         <w:spacing w:after="400" w:before="0"/>
       </w:pPr>
@@ -111,11 +111,32 @@
         <w:rPr>
           <w:b w:val="0"/>
           <w:color w:val="52616D"/>
-          <w:sz w:val="16"/>
+          <w:sz w:val="19"/>
         </w:rPr>
-        <w:t>PAYOUT DESTINATIONS</w:t>
+        <w:t>For businesses operating globally</w:t>
         <w:tab/>
-        <w:t>ACCOUNT BALANCE CURRENCIES</w:t>
+        <w:t>Pay suppliers, teams, and partners</w:t>
+      </w:r>
+    </w:p>
+    <w:p>
+      <w:pPr>
+        <w:spacing w:after="340" w:before="0"/>
+      </w:pPr>
+      <w:r>
+        <w:rPr>
+          <w:b/>
+          <w:color w:val="0A2540"/>
+          <w:sz w:val="21"/>
+        </w:rPr>
+        <w:t xml:space="preserve">Built for </w:t>
+      </w:r>
+      <w:r>
+        <w:rPr>
+          <w:b w:val="0"/>
+          <w:color w:val="263442"/>
+          <w:sz w:val="21"/>
+        </w:rPr>
+        <w:t>individuals, international businesses, global employers, marketplaces, payroll platforms, and fintechs.</w:t>
       </w:r>
     </w:p>
     <w:p>
@@ -141,15 +162,15 @@
         <w:spacing w:after="0" w:before="0"/>
       </w:pPr>
       <w:r>
-        <w:t>Personal banking</w:t>
+        <w:t>Business banking and payments</w:t>
       </w:r>
     </w:p>
     <w:p>
       <w:pPr>
-        <w:spacing w:after="650" w:before="0"/>
+        <w:spacing w:after="340" w:before="0"/>
       </w:pPr>
       <w:r>
-        <w:t>Hold multiple currencies, receive payments, and send money to people and businesses in the US and around the world. Manage everyday finances through the Easner app or on desktop.</w:t>
+        <w:t>Hold USD, EUR, and GBP balances. Collect revenue with Invoicing, Checkout, and Payment Links, including invoices payable in supported stablecoins. Pay suppliers and run Payroll for employees and contractors, with recurring payment workflows, team access, approvals, and payment records in one dashboard.</w:t>
       </w:r>
     </w:p>
     <w:p>
@@ -158,7 +179,7 @@
         <w:spacing w:after="0" w:before="0"/>
       </w:pPr>
       <w:r>
-        <w:t>Business banking and payments</w:t>
+        <w:t>Personal banking</w:t>
       </w:r>
     </w:p>
     <w:p>
@@ -166,7 +187,7 @@
         <w:spacing w:after="0" w:before="0"/>
       </w:pPr>
       <w:r>
-        <w:t>Bring accounts, collections, and payouts into one dashboard. Get paid through Invoicing, Checkout, and Payment Links. Pay suppliers, employees, and contractors, with team access, approvals, and payment records.</w:t>
+        <w:t>Hold USD, EUR, and GBP balances, receive payments, and send money worldwide. Manage everyday finances through the Easner app or on desktop.</w:t>
       </w:r>
     </w:p>
     <w:p>
@@ -183,15 +204,15 @@
         <w:spacing w:after="0" w:before="0"/>
       </w:pPr>
       <w:r>
-        <w:t>Global payments made practical</w:t>
+        <w:t>Infrastructure for partners</w:t>
       </w:r>
     </w:p>
     <w:p>
       <w:pPr>
-        <w:spacing w:after="340" w:before="0"/>
+        <w:spacing w:after="650" w:before="0"/>
       </w:pPr>
       <w:r>
-        <w:t>Easner connects US, EU, and UK payment infrastructure to local payouts worldwide. Stablecoin settlement runs behind the scenes, so customers can send dollars and recipients receive local currency without managing a crypto wallet.</w:t>
+        <w:t>Use Easner directly for business banking, embed accounts and payments in your software, or launch a branded payment experience. APIs connect verification, collections, payouts, and webhooks, supported by commercial onboarding and operational support.</w:t>
       </w:r>
     </w:p>
     <w:p>
@@ -200,7 +221,7 @@
         <w:spacing w:after="0" w:before="0"/>
       </w:pPr>
       <w:r>
-        <w:t>Infrastructure for partners</w:t>
+        <w:t>Blockchain at the core</w:t>
       </w:r>
     </w:p>
     <w:p>
@@ -208,7 +229,7 @@
         <w:spacing w:after="0" w:before="0"/>
       </w:pPr>
       <w:r>
-        <w:t>Launch branded financial programs or embed accounts and payments through Easner APIs. Build with verification, collections, payouts, and webhooks, supported by commercial onboarding and operational support.</w:t>
+        <w:t>Blockchain and stablecoins power Easner. Send and receive supported stablecoins directly, or use familiar account and payment flows. Stablecoin settlement connects US, EU, and UK payment infrastructure to local payouts worldwide.</w:t>
       </w:r>
     </w:p>
     <w:p>
@@ -238,7 +259,7 @@
           <w:color w:val="0A2540"/>
           <w:sz w:val="26"/>
         </w:rPr>
-        <w:t>Explore Easner</w:t>
+        <w:t>Discuss your payment flows and partnership opportunities</w:t>
       </w:r>
     </w:p>
     <w:p>
@@ -269,7 +290,7 @@
             <w:color w:val="007ACC"/>
             <w:sz w:val="22"/>
           </w:rPr>
-          <w:t>Get the app</w:t>
+          <w:t>Explore Easner Business</w:t>
         </w:r>
       </w:hyperlink>
       <w:r>
@@ -299,7 +320,7 @@
           <w:color w:val="61707B"/>
           <w:sz w:val="17"/>
         </w:rPr>
-        <w:t>Easner is a financial technology company, not a bank. Banking and payment services are provided by licensed partners. Account and product availability depend on verification, jurisdiction, approval, and partner rules. Payout coverage does not determine account eligibility. Fees and exchange rates are shown before transfer confirmation; payment timing varies.</w:t>
+        <w:t>Easner is a financial technology company, not a bank. Banking and payment services are provided by licensed partners. Account and product availability depend on verification, jurisdiction, approval, and partner rules. Payout coverage does not determine account eligibility.</w:t>
       </w:r>
     </w:p>
     <w:sectPr>

</xml_diff>